<commit_message>
Newsletter uses the theme body font, Aptos (Body)
Co-Authored-By: Claude Opus 5.5 <noreply@anthropic.com>
Claude-Session: https://claude.ai/code/session_01CaSiWMfPYwo4KnTeunEiS2
</commit_message>
<xml_diff>
--- a/data/newsletters/GW8_FPL_Newsletter.docx
+++ b/data/newsletters/GW8_FPL_Newsletter.docx
@@ -44,7 +44,7 @@
             </w:pPr>
             <w:r>
               <w:rPr>
-                <w:rFonts w:ascii="Aptos" w:cs="Aptos" w:eastAsia="Aptos" w:hAnsi="Aptos"/>
+                <w:rFonts w:asciiTheme="minorHAnsi" w:hAnsiTheme="minorHAnsi" w:eastAsiaTheme="minorHAnsi" w:cstheme="minorBidi"/>
                 <w:b/>
                 <w:bCs/>
                 <w:color w:val="FFFFFF"/>
@@ -61,7 +61,7 @@
             </w:pPr>
             <w:r>
               <w:rPr>
-                <w:rFonts w:ascii="Aptos" w:cs="Aptos" w:eastAsia="Aptos" w:hAnsi="Aptos"/>
+                <w:rFonts w:asciiTheme="minorHAnsi" w:hAnsiTheme="minorHAnsi" w:eastAsiaTheme="minorHAnsi" w:cstheme="minorBidi"/>
                 <w:b/>
                 <w:bCs/>
                 <w:color w:val="FFFFFF"/>
@@ -76,10 +76,10 @@
               <w:spacing w:after="0" w:before="0"/>
               <w:jc w:val="center"/>
             </w:pPr>
-            <w:hyperlink w:history="1" r:id="rId1j0tdd9p4rhw6edfofzfo">
+            <w:hyperlink w:history="1" r:id="rIdah-eqrelvxutrdm4c_a9p">
               <w:r>
                 <w:rPr>
-                  <w:rFonts w:ascii="Aptos" w:cs="Aptos" w:eastAsia="Aptos" w:hAnsi="Aptos"/>
+                  <w:rFonts w:asciiTheme="minorHAnsi" w:hAnsiTheme="minorHAnsi" w:eastAsiaTheme="minorHAnsi" w:cstheme="minorBidi"/>
                   <w:b/>
                   <w:bCs/>
                   <w:color w:val="00FF87"/>
@@ -134,7 +134,7 @@
             </w:pPr>
             <w:r>
               <w:rPr>
-                <w:rFonts w:ascii="Aptos" w:cs="Aptos" w:eastAsia="Aptos" w:hAnsi="Aptos"/>
+                <w:rFonts w:asciiTheme="minorHAnsi" w:hAnsiTheme="minorHAnsi" w:eastAsiaTheme="minorHAnsi" w:cstheme="minorBidi"/>
                 <w:sz w:val="21"/>
                 <w:szCs w:val="21"/>
               </w:rPr>
@@ -148,7 +148,7 @@
             </w:pPr>
             <w:r>
               <w:rPr>
-                <w:rFonts w:ascii="Aptos" w:cs="Aptos" w:eastAsia="Aptos" w:hAnsi="Aptos"/>
+                <w:rFonts w:asciiTheme="minorHAnsi" w:hAnsiTheme="minorHAnsi" w:eastAsiaTheme="minorHAnsi" w:cstheme="minorBidi"/>
                 <w:b/>
                 <w:bCs/>
                 <w:sz w:val="21"/>
@@ -168,7 +168,7 @@
             </w:pPr>
             <w:r>
               <w:rPr>
-                <w:rFonts w:ascii="Aptos" w:cs="Aptos" w:eastAsia="Aptos" w:hAnsi="Aptos"/>
+                <w:rFonts w:asciiTheme="minorHAnsi" w:hAnsiTheme="minorHAnsi" w:eastAsiaTheme="minorHAnsi" w:cstheme="minorBidi"/>
                 <w:sz w:val="21"/>
                 <w:szCs w:val="21"/>
               </w:rPr>
@@ -186,7 +186,7 @@
             </w:pPr>
             <w:r>
               <w:rPr>
-                <w:rFonts w:ascii="Aptos" w:cs="Aptos" w:eastAsia="Aptos" w:hAnsi="Aptos"/>
+                <w:rFonts w:asciiTheme="minorHAnsi" w:hAnsiTheme="minorHAnsi" w:eastAsiaTheme="minorHAnsi" w:cstheme="minorBidi"/>
                 <w:sz w:val="21"/>
                 <w:szCs w:val="21"/>
               </w:rPr>
@@ -204,7 +204,7 @@
             </w:pPr>
             <w:r>
               <w:rPr>
-                <w:rFonts w:ascii="Aptos" w:cs="Aptos" w:eastAsia="Aptos" w:hAnsi="Aptos"/>
+                <w:rFonts w:asciiTheme="minorHAnsi" w:hAnsiTheme="minorHAnsi" w:eastAsiaTheme="minorHAnsi" w:cstheme="minorBidi"/>
                 <w:sz w:val="21"/>
                 <w:szCs w:val="21"/>
               </w:rPr>
@@ -222,7 +222,7 @@
             </w:pPr>
             <w:r>
               <w:rPr>
-                <w:rFonts w:ascii="Aptos" w:cs="Aptos" w:eastAsia="Aptos" w:hAnsi="Aptos"/>
+                <w:rFonts w:asciiTheme="minorHAnsi" w:hAnsiTheme="minorHAnsi" w:eastAsiaTheme="minorHAnsi" w:cstheme="minorBidi"/>
                 <w:sz w:val="21"/>
                 <w:szCs w:val="21"/>
               </w:rPr>
@@ -240,7 +240,7 @@
             </w:pPr>
             <w:r>
               <w:rPr>
-                <w:rFonts w:ascii="Aptos" w:cs="Aptos" w:eastAsia="Aptos" w:hAnsi="Aptos"/>
+                <w:rFonts w:asciiTheme="minorHAnsi" w:hAnsiTheme="minorHAnsi" w:eastAsiaTheme="minorHAnsi" w:cstheme="minorBidi"/>
                 <w:sz w:val="21"/>
                 <w:szCs w:val="21"/>
               </w:rPr>
@@ -254,7 +254,7 @@
             </w:pPr>
             <w:r>
               <w:rPr>
-                <w:rFonts w:ascii="Aptos" w:cs="Aptos" w:eastAsia="Aptos" w:hAnsi="Aptos"/>
+                <w:rFonts w:asciiTheme="minorHAnsi" w:hAnsiTheme="minorHAnsi" w:eastAsiaTheme="minorHAnsi" w:cstheme="minorBidi"/>
                 <w:b/>
                 <w:bCs/>
                 <w:sz w:val="21"/>
@@ -274,7 +274,7 @@
             </w:pPr>
             <w:r>
               <w:rPr>
-                <w:rFonts w:ascii="Aptos" w:cs="Aptos" w:eastAsia="Aptos" w:hAnsi="Aptos"/>
+                <w:rFonts w:asciiTheme="minorHAnsi" w:hAnsiTheme="minorHAnsi" w:eastAsiaTheme="minorHAnsi" w:cstheme="minorBidi"/>
                 <w:sz w:val="21"/>
                 <w:szCs w:val="21"/>
               </w:rPr>
@@ -292,7 +292,7 @@
             </w:pPr>
             <w:r>
               <w:rPr>
-                <w:rFonts w:ascii="Aptos" w:cs="Aptos" w:eastAsia="Aptos" w:hAnsi="Aptos"/>
+                <w:rFonts w:asciiTheme="minorHAnsi" w:hAnsiTheme="minorHAnsi" w:eastAsiaTheme="minorHAnsi" w:cstheme="minorBidi"/>
                 <w:sz w:val="21"/>
                 <w:szCs w:val="21"/>
               </w:rPr>
@@ -310,7 +310,7 @@
             </w:pPr>
             <w:r>
               <w:rPr>
-                <w:rFonts w:ascii="Aptos" w:cs="Aptos" w:eastAsia="Aptos" w:hAnsi="Aptos"/>
+                <w:rFonts w:asciiTheme="minorHAnsi" w:hAnsiTheme="minorHAnsi" w:eastAsiaTheme="minorHAnsi" w:cstheme="minorBidi"/>
                 <w:sz w:val="21"/>
                 <w:szCs w:val="21"/>
               </w:rPr>
@@ -326,7 +326,7 @@
       </w:pPr>
       <w:r>
         <w:rPr>
-          <w:rFonts w:ascii="Aptos" w:cs="Aptos" w:eastAsia="Aptos" w:hAnsi="Aptos"/>
+          <w:rFonts w:asciiTheme="minorHAnsi" w:hAnsiTheme="minorHAnsi" w:eastAsiaTheme="minorHAnsi" w:cstheme="minorBidi"/>
           <w:sz w:val="21"/>
           <w:szCs w:val="21"/>
         </w:rPr>
@@ -410,7 +410,7 @@
                   </w:pPr>
                   <w:r>
                     <w:rPr>
-                      <w:rFonts w:ascii="Aptos" w:cs="Aptos" w:eastAsia="Aptos" w:hAnsi="Aptos"/>
+                      <w:rFonts w:asciiTheme="minorHAnsi" w:hAnsiTheme="minorHAnsi" w:eastAsiaTheme="minorHAnsi" w:cstheme="minorBidi"/>
                       <w:b/>
                       <w:bCs/>
                       <w:color w:val="FFFFFF"/>
@@ -470,7 +470,7 @@
                   </w:pPr>
                   <w:r>
                     <w:rPr>
-                      <w:rFonts w:ascii="Aptos" w:cs="Aptos" w:eastAsia="Aptos" w:hAnsi="Aptos"/>
+                      <w:rFonts w:asciiTheme="minorHAnsi" w:hAnsiTheme="minorHAnsi" w:eastAsiaTheme="minorHAnsi" w:cstheme="minorBidi"/>
                       <w:b/>
                       <w:bCs/>
                       <w:sz w:val="16"/>
@@ -505,7 +505,7 @@
                   </w:pPr>
                   <w:r>
                     <w:rPr>
-                      <w:rFonts w:ascii="Aptos" w:cs="Aptos" w:eastAsia="Aptos" w:hAnsi="Aptos"/>
+                      <w:rFonts w:asciiTheme="minorHAnsi" w:hAnsiTheme="minorHAnsi" w:eastAsiaTheme="minorHAnsi" w:cstheme="minorBidi"/>
                       <w:b/>
                       <w:bCs/>
                       <w:sz w:val="16"/>
@@ -540,7 +540,7 @@
                   </w:pPr>
                   <w:r>
                     <w:rPr>
-                      <w:rFonts w:ascii="Aptos" w:cs="Aptos" w:eastAsia="Aptos" w:hAnsi="Aptos"/>
+                      <w:rFonts w:asciiTheme="minorHAnsi" w:hAnsiTheme="minorHAnsi" w:eastAsiaTheme="minorHAnsi" w:cstheme="minorBidi"/>
                       <w:b/>
                       <w:bCs/>
                       <w:sz w:val="16"/>
@@ -580,7 +580,7 @@
                   </w:pPr>
                   <w:r>
                     <w:rPr>
-                      <w:rFonts w:ascii="Aptos" w:cs="Aptos" w:eastAsia="Aptos" w:hAnsi="Aptos"/>
+                      <w:rFonts w:asciiTheme="minorHAnsi" w:hAnsiTheme="minorHAnsi" w:eastAsiaTheme="minorHAnsi" w:cstheme="minorBidi"/>
                       <w:b/>
                       <w:bCs/>
                       <w:sz w:val="16"/>
@@ -621,7 +621,7 @@
                   </w:pPr>
                   <w:r>
                     <w:rPr>
-                      <w:rFonts w:ascii="Aptos" w:cs="Aptos" w:eastAsia="Aptos" w:hAnsi="Aptos"/>
+                      <w:rFonts w:asciiTheme="minorHAnsi" w:hAnsiTheme="minorHAnsi" w:eastAsiaTheme="minorHAnsi" w:cstheme="minorBidi"/>
                       <w:sz w:val="16"/>
                       <w:szCs w:val="16"/>
                     </w:rPr>
@@ -654,7 +654,7 @@
                   </w:pPr>
                   <w:r>
                     <w:rPr>
-                      <w:rFonts w:ascii="Aptos" w:cs="Aptos" w:eastAsia="Aptos" w:hAnsi="Aptos"/>
+                      <w:rFonts w:asciiTheme="minorHAnsi" w:hAnsiTheme="minorHAnsi" w:eastAsiaTheme="minorHAnsi" w:cstheme="minorBidi"/>
                       <w:sz w:val="16"/>
                       <w:szCs w:val="16"/>
                     </w:rPr>
@@ -687,7 +687,7 @@
                   </w:pPr>
                   <w:r>
                     <w:rPr>
-                      <w:rFonts w:ascii="Aptos" w:cs="Aptos" w:eastAsia="Aptos" w:hAnsi="Aptos"/>
+                      <w:rFonts w:asciiTheme="minorHAnsi" w:hAnsiTheme="minorHAnsi" w:eastAsiaTheme="minorHAnsi" w:cstheme="minorBidi"/>
                       <w:sz w:val="16"/>
                       <w:szCs w:val="16"/>
                     </w:rPr>
@@ -725,7 +725,7 @@
                   </w:pPr>
                   <w:r>
                     <w:rPr>
-                      <w:rFonts w:ascii="Aptos" w:cs="Aptos" w:eastAsia="Aptos" w:hAnsi="Aptos"/>
+                      <w:rFonts w:asciiTheme="minorHAnsi" w:hAnsiTheme="minorHAnsi" w:eastAsiaTheme="minorHAnsi" w:cstheme="minorBidi"/>
                       <w:b/>
                       <w:bCs/>
                       <w:sz w:val="16"/>
@@ -766,7 +766,7 @@
                   </w:pPr>
                   <w:r>
                     <w:rPr>
-                      <w:rFonts w:ascii="Aptos" w:cs="Aptos" w:eastAsia="Aptos" w:hAnsi="Aptos"/>
+                      <w:rFonts w:asciiTheme="minorHAnsi" w:hAnsiTheme="minorHAnsi" w:eastAsiaTheme="minorHAnsi" w:cstheme="minorBidi"/>
                       <w:sz w:val="16"/>
                       <w:szCs w:val="16"/>
                     </w:rPr>
@@ -799,7 +799,7 @@
                   </w:pPr>
                   <w:r>
                     <w:rPr>
-                      <w:rFonts w:ascii="Aptos" w:cs="Aptos" w:eastAsia="Aptos" w:hAnsi="Aptos"/>
+                      <w:rFonts w:asciiTheme="minorHAnsi" w:hAnsiTheme="minorHAnsi" w:eastAsiaTheme="minorHAnsi" w:cstheme="minorBidi"/>
                       <w:sz w:val="16"/>
                       <w:szCs w:val="16"/>
                     </w:rPr>
@@ -832,7 +832,7 @@
                   </w:pPr>
                   <w:r>
                     <w:rPr>
-                      <w:rFonts w:ascii="Aptos" w:cs="Aptos" w:eastAsia="Aptos" w:hAnsi="Aptos"/>
+                      <w:rFonts w:asciiTheme="minorHAnsi" w:hAnsiTheme="minorHAnsi" w:eastAsiaTheme="minorHAnsi" w:cstheme="minorBidi"/>
                       <w:sz w:val="16"/>
                       <w:szCs w:val="16"/>
                     </w:rPr>
@@ -870,7 +870,7 @@
                   </w:pPr>
                   <w:r>
                     <w:rPr>
-                      <w:rFonts w:ascii="Aptos" w:cs="Aptos" w:eastAsia="Aptos" w:hAnsi="Aptos"/>
+                      <w:rFonts w:asciiTheme="minorHAnsi" w:hAnsiTheme="minorHAnsi" w:eastAsiaTheme="minorHAnsi" w:cstheme="minorBidi"/>
                       <w:b/>
                       <w:bCs/>
                       <w:sz w:val="16"/>
@@ -911,7 +911,7 @@
                   </w:pPr>
                   <w:r>
                     <w:rPr>
-                      <w:rFonts w:ascii="Aptos" w:cs="Aptos" w:eastAsia="Aptos" w:hAnsi="Aptos"/>
+                      <w:rFonts w:asciiTheme="minorHAnsi" w:hAnsiTheme="minorHAnsi" w:eastAsiaTheme="minorHAnsi" w:cstheme="minorBidi"/>
                       <w:sz w:val="16"/>
                       <w:szCs w:val="16"/>
                     </w:rPr>
@@ -944,7 +944,7 @@
                   </w:pPr>
                   <w:r>
                     <w:rPr>
-                      <w:rFonts w:ascii="Aptos" w:cs="Aptos" w:eastAsia="Aptos" w:hAnsi="Aptos"/>
+                      <w:rFonts w:asciiTheme="minorHAnsi" w:hAnsiTheme="minorHAnsi" w:eastAsiaTheme="minorHAnsi" w:cstheme="minorBidi"/>
                       <w:sz w:val="16"/>
                       <w:szCs w:val="16"/>
                     </w:rPr>
@@ -977,7 +977,7 @@
                   </w:pPr>
                   <w:r>
                     <w:rPr>
-                      <w:rFonts w:ascii="Aptos" w:cs="Aptos" w:eastAsia="Aptos" w:hAnsi="Aptos"/>
+                      <w:rFonts w:asciiTheme="minorHAnsi" w:hAnsiTheme="minorHAnsi" w:eastAsiaTheme="minorHAnsi" w:cstheme="minorBidi"/>
                       <w:sz w:val="16"/>
                       <w:szCs w:val="16"/>
                     </w:rPr>
@@ -1015,7 +1015,7 @@
                   </w:pPr>
                   <w:r>
                     <w:rPr>
-                      <w:rFonts w:ascii="Aptos" w:cs="Aptos" w:eastAsia="Aptos" w:hAnsi="Aptos"/>
+                      <w:rFonts w:asciiTheme="minorHAnsi" w:hAnsiTheme="minorHAnsi" w:eastAsiaTheme="minorHAnsi" w:cstheme="minorBidi"/>
                       <w:b/>
                       <w:bCs/>
                       <w:sz w:val="16"/>
@@ -1056,7 +1056,7 @@
                   </w:pPr>
                   <w:r>
                     <w:rPr>
-                      <w:rFonts w:ascii="Aptos" w:cs="Aptos" w:eastAsia="Aptos" w:hAnsi="Aptos"/>
+                      <w:rFonts w:asciiTheme="minorHAnsi" w:hAnsiTheme="minorHAnsi" w:eastAsiaTheme="minorHAnsi" w:cstheme="minorBidi"/>
                       <w:sz w:val="16"/>
                       <w:szCs w:val="16"/>
                     </w:rPr>
@@ -1089,7 +1089,7 @@
                   </w:pPr>
                   <w:r>
                     <w:rPr>
-                      <w:rFonts w:ascii="Aptos" w:cs="Aptos" w:eastAsia="Aptos" w:hAnsi="Aptos"/>
+                      <w:rFonts w:asciiTheme="minorHAnsi" w:hAnsiTheme="minorHAnsi" w:eastAsiaTheme="minorHAnsi" w:cstheme="minorBidi"/>
                       <w:sz w:val="16"/>
                       <w:szCs w:val="16"/>
                     </w:rPr>
@@ -1122,7 +1122,7 @@
                   </w:pPr>
                   <w:r>
                     <w:rPr>
-                      <w:rFonts w:ascii="Aptos" w:cs="Aptos" w:eastAsia="Aptos" w:hAnsi="Aptos"/>
+                      <w:rFonts w:asciiTheme="minorHAnsi" w:hAnsiTheme="minorHAnsi" w:eastAsiaTheme="minorHAnsi" w:cstheme="minorBidi"/>
                       <w:sz w:val="16"/>
                       <w:szCs w:val="16"/>
                     </w:rPr>
@@ -1160,7 +1160,7 @@
                   </w:pPr>
                   <w:r>
                     <w:rPr>
-                      <w:rFonts w:ascii="Aptos" w:cs="Aptos" w:eastAsia="Aptos" w:hAnsi="Aptos"/>
+                      <w:rFonts w:asciiTheme="minorHAnsi" w:hAnsiTheme="minorHAnsi" w:eastAsiaTheme="minorHAnsi" w:cstheme="minorBidi"/>
                       <w:b/>
                       <w:bCs/>
                       <w:sz w:val="16"/>
@@ -1201,7 +1201,7 @@
                   </w:pPr>
                   <w:r>
                     <w:rPr>
-                      <w:rFonts w:ascii="Aptos" w:cs="Aptos" w:eastAsia="Aptos" w:hAnsi="Aptos"/>
+                      <w:rFonts w:asciiTheme="minorHAnsi" w:hAnsiTheme="minorHAnsi" w:eastAsiaTheme="minorHAnsi" w:cstheme="minorBidi"/>
                       <w:sz w:val="16"/>
                       <w:szCs w:val="16"/>
                     </w:rPr>
@@ -1234,7 +1234,7 @@
                   </w:pPr>
                   <w:r>
                     <w:rPr>
-                      <w:rFonts w:ascii="Aptos" w:cs="Aptos" w:eastAsia="Aptos" w:hAnsi="Aptos"/>
+                      <w:rFonts w:asciiTheme="minorHAnsi" w:hAnsiTheme="minorHAnsi" w:eastAsiaTheme="minorHAnsi" w:cstheme="minorBidi"/>
                       <w:sz w:val="16"/>
                       <w:szCs w:val="16"/>
                     </w:rPr>
@@ -1267,7 +1267,7 @@
                   </w:pPr>
                   <w:r>
                     <w:rPr>
-                      <w:rFonts w:ascii="Aptos" w:cs="Aptos" w:eastAsia="Aptos" w:hAnsi="Aptos"/>
+                      <w:rFonts w:asciiTheme="minorHAnsi" w:hAnsiTheme="minorHAnsi" w:eastAsiaTheme="minorHAnsi" w:cstheme="minorBidi"/>
                       <w:sz w:val="16"/>
                       <w:szCs w:val="16"/>
                     </w:rPr>
@@ -1305,7 +1305,7 @@
                   </w:pPr>
                   <w:r>
                     <w:rPr>
-                      <w:rFonts w:ascii="Aptos" w:cs="Aptos" w:eastAsia="Aptos" w:hAnsi="Aptos"/>
+                      <w:rFonts w:asciiTheme="minorHAnsi" w:hAnsiTheme="minorHAnsi" w:eastAsiaTheme="minorHAnsi" w:cstheme="minorBidi"/>
                       <w:b/>
                       <w:bCs/>
                       <w:sz w:val="16"/>
@@ -1346,7 +1346,7 @@
                   </w:pPr>
                   <w:r>
                     <w:rPr>
-                      <w:rFonts w:ascii="Aptos" w:cs="Aptos" w:eastAsia="Aptos" w:hAnsi="Aptos"/>
+                      <w:rFonts w:asciiTheme="minorHAnsi" w:hAnsiTheme="minorHAnsi" w:eastAsiaTheme="minorHAnsi" w:cstheme="minorBidi"/>
                       <w:sz w:val="16"/>
                       <w:szCs w:val="16"/>
                     </w:rPr>
@@ -1379,7 +1379,7 @@
                   </w:pPr>
                   <w:r>
                     <w:rPr>
-                      <w:rFonts w:ascii="Aptos" w:cs="Aptos" w:eastAsia="Aptos" w:hAnsi="Aptos"/>
+                      <w:rFonts w:asciiTheme="minorHAnsi" w:hAnsiTheme="minorHAnsi" w:eastAsiaTheme="minorHAnsi" w:cstheme="minorBidi"/>
                       <w:sz w:val="16"/>
                       <w:szCs w:val="16"/>
                     </w:rPr>
@@ -1412,7 +1412,7 @@
                   </w:pPr>
                   <w:r>
                     <w:rPr>
-                      <w:rFonts w:ascii="Aptos" w:cs="Aptos" w:eastAsia="Aptos" w:hAnsi="Aptos"/>
+                      <w:rFonts w:asciiTheme="minorHAnsi" w:hAnsiTheme="minorHAnsi" w:eastAsiaTheme="minorHAnsi" w:cstheme="minorBidi"/>
                       <w:sz w:val="16"/>
                       <w:szCs w:val="16"/>
                     </w:rPr>
@@ -1450,7 +1450,7 @@
                   </w:pPr>
                   <w:r>
                     <w:rPr>
-                      <w:rFonts w:ascii="Aptos" w:cs="Aptos" w:eastAsia="Aptos" w:hAnsi="Aptos"/>
+                      <w:rFonts w:asciiTheme="minorHAnsi" w:hAnsiTheme="minorHAnsi" w:eastAsiaTheme="minorHAnsi" w:cstheme="minorBidi"/>
                       <w:b/>
                       <w:bCs/>
                       <w:sz w:val="16"/>
@@ -1491,7 +1491,7 @@
                   </w:pPr>
                   <w:r>
                     <w:rPr>
-                      <w:rFonts w:ascii="Aptos" w:cs="Aptos" w:eastAsia="Aptos" w:hAnsi="Aptos"/>
+                      <w:rFonts w:asciiTheme="minorHAnsi" w:hAnsiTheme="minorHAnsi" w:eastAsiaTheme="minorHAnsi" w:cstheme="minorBidi"/>
                       <w:sz w:val="16"/>
                       <w:szCs w:val="16"/>
                     </w:rPr>
@@ -1524,7 +1524,7 @@
                   </w:pPr>
                   <w:r>
                     <w:rPr>
-                      <w:rFonts w:ascii="Aptos" w:cs="Aptos" w:eastAsia="Aptos" w:hAnsi="Aptos"/>
+                      <w:rFonts w:asciiTheme="minorHAnsi" w:hAnsiTheme="minorHAnsi" w:eastAsiaTheme="minorHAnsi" w:cstheme="minorBidi"/>
                       <w:sz w:val="16"/>
                       <w:szCs w:val="16"/>
                     </w:rPr>
@@ -1557,7 +1557,7 @@
                   </w:pPr>
                   <w:r>
                     <w:rPr>
-                      <w:rFonts w:ascii="Aptos" w:cs="Aptos" w:eastAsia="Aptos" w:hAnsi="Aptos"/>
+                      <w:rFonts w:asciiTheme="minorHAnsi" w:hAnsiTheme="minorHAnsi" w:eastAsiaTheme="minorHAnsi" w:cstheme="minorBidi"/>
                       <w:sz w:val="16"/>
                       <w:szCs w:val="16"/>
                     </w:rPr>
@@ -1595,7 +1595,7 @@
                   </w:pPr>
                   <w:r>
                     <w:rPr>
-                      <w:rFonts w:ascii="Aptos" w:cs="Aptos" w:eastAsia="Aptos" w:hAnsi="Aptos"/>
+                      <w:rFonts w:asciiTheme="minorHAnsi" w:hAnsiTheme="minorHAnsi" w:eastAsiaTheme="minorHAnsi" w:cstheme="minorBidi"/>
                       <w:b/>
                       <w:bCs/>
                       <w:sz w:val="16"/>
@@ -1636,7 +1636,7 @@
                   </w:pPr>
                   <w:r>
                     <w:rPr>
-                      <w:rFonts w:ascii="Aptos" w:cs="Aptos" w:eastAsia="Aptos" w:hAnsi="Aptos"/>
+                      <w:rFonts w:asciiTheme="minorHAnsi" w:hAnsiTheme="minorHAnsi" w:eastAsiaTheme="minorHAnsi" w:cstheme="minorBidi"/>
                       <w:sz w:val="16"/>
                       <w:szCs w:val="16"/>
                     </w:rPr>
@@ -1669,7 +1669,7 @@
                   </w:pPr>
                   <w:r>
                     <w:rPr>
-                      <w:rFonts w:ascii="Aptos" w:cs="Aptos" w:eastAsia="Aptos" w:hAnsi="Aptos"/>
+                      <w:rFonts w:asciiTheme="minorHAnsi" w:hAnsiTheme="minorHAnsi" w:eastAsiaTheme="minorHAnsi" w:cstheme="minorBidi"/>
                       <w:sz w:val="16"/>
                       <w:szCs w:val="16"/>
                     </w:rPr>
@@ -1702,7 +1702,7 @@
                   </w:pPr>
                   <w:r>
                     <w:rPr>
-                      <w:rFonts w:ascii="Aptos" w:cs="Aptos" w:eastAsia="Aptos" w:hAnsi="Aptos"/>
+                      <w:rFonts w:asciiTheme="minorHAnsi" w:hAnsiTheme="minorHAnsi" w:eastAsiaTheme="minorHAnsi" w:cstheme="minorBidi"/>
                       <w:sz w:val="16"/>
                       <w:szCs w:val="16"/>
                     </w:rPr>
@@ -1740,7 +1740,7 @@
                   </w:pPr>
                   <w:r>
                     <w:rPr>
-                      <w:rFonts w:ascii="Aptos" w:cs="Aptos" w:eastAsia="Aptos" w:hAnsi="Aptos"/>
+                      <w:rFonts w:asciiTheme="minorHAnsi" w:hAnsiTheme="minorHAnsi" w:eastAsiaTheme="minorHAnsi" w:cstheme="minorBidi"/>
                       <w:b/>
                       <w:bCs/>
                       <w:sz w:val="16"/>
@@ -1781,7 +1781,7 @@
                   </w:pPr>
                   <w:r>
                     <w:rPr>
-                      <w:rFonts w:ascii="Aptos" w:cs="Aptos" w:eastAsia="Aptos" w:hAnsi="Aptos"/>
+                      <w:rFonts w:asciiTheme="minorHAnsi" w:hAnsiTheme="minorHAnsi" w:eastAsiaTheme="minorHAnsi" w:cstheme="minorBidi"/>
                       <w:sz w:val="16"/>
                       <w:szCs w:val="16"/>
                     </w:rPr>
@@ -1814,7 +1814,7 @@
                   </w:pPr>
                   <w:r>
                     <w:rPr>
-                      <w:rFonts w:ascii="Aptos" w:cs="Aptos" w:eastAsia="Aptos" w:hAnsi="Aptos"/>
+                      <w:rFonts w:asciiTheme="minorHAnsi" w:hAnsiTheme="minorHAnsi" w:eastAsiaTheme="minorHAnsi" w:cstheme="minorBidi"/>
                       <w:sz w:val="16"/>
                       <w:szCs w:val="16"/>
                     </w:rPr>
@@ -1847,7 +1847,7 @@
                   </w:pPr>
                   <w:r>
                     <w:rPr>
-                      <w:rFonts w:ascii="Aptos" w:cs="Aptos" w:eastAsia="Aptos" w:hAnsi="Aptos"/>
+                      <w:rFonts w:asciiTheme="minorHAnsi" w:hAnsiTheme="minorHAnsi" w:eastAsiaTheme="minorHAnsi" w:cstheme="minorBidi"/>
                       <w:sz w:val="16"/>
                       <w:szCs w:val="16"/>
                     </w:rPr>
@@ -1885,7 +1885,7 @@
                   </w:pPr>
                   <w:r>
                     <w:rPr>
-                      <w:rFonts w:ascii="Aptos" w:cs="Aptos" w:eastAsia="Aptos" w:hAnsi="Aptos"/>
+                      <w:rFonts w:asciiTheme="minorHAnsi" w:hAnsiTheme="minorHAnsi" w:eastAsiaTheme="minorHAnsi" w:cstheme="minorBidi"/>
                       <w:b/>
                       <w:bCs/>
                       <w:sz w:val="16"/>
@@ -1926,7 +1926,7 @@
                   </w:pPr>
                   <w:r>
                     <w:rPr>
-                      <w:rFonts w:ascii="Aptos" w:cs="Aptos" w:eastAsia="Aptos" w:hAnsi="Aptos"/>
+                      <w:rFonts w:asciiTheme="minorHAnsi" w:hAnsiTheme="minorHAnsi" w:eastAsiaTheme="minorHAnsi" w:cstheme="minorBidi"/>
                       <w:sz w:val="16"/>
                       <w:szCs w:val="16"/>
                     </w:rPr>
@@ -1959,7 +1959,7 @@
                   </w:pPr>
                   <w:r>
                     <w:rPr>
-                      <w:rFonts w:ascii="Aptos" w:cs="Aptos" w:eastAsia="Aptos" w:hAnsi="Aptos"/>
+                      <w:rFonts w:asciiTheme="minorHAnsi" w:hAnsiTheme="minorHAnsi" w:eastAsiaTheme="minorHAnsi" w:cstheme="minorBidi"/>
                       <w:sz w:val="16"/>
                       <w:szCs w:val="16"/>
                     </w:rPr>
@@ -1992,7 +1992,7 @@
                   </w:pPr>
                   <w:r>
                     <w:rPr>
-                      <w:rFonts w:ascii="Aptos" w:cs="Aptos" w:eastAsia="Aptos" w:hAnsi="Aptos"/>
+                      <w:rFonts w:asciiTheme="minorHAnsi" w:hAnsiTheme="minorHAnsi" w:eastAsiaTheme="minorHAnsi" w:cstheme="minorBidi"/>
                       <w:sz w:val="16"/>
                       <w:szCs w:val="16"/>
                     </w:rPr>
@@ -2008,7 +2008,7 @@
             </w:pPr>
             <w:r>
               <w:rPr>
-                <w:rFonts w:ascii="Aptos" w:cs="Aptos" w:eastAsia="Aptos" w:hAnsi="Aptos"/>
+                <w:rFonts w:asciiTheme="minorHAnsi" w:hAnsiTheme="minorHAnsi" w:eastAsiaTheme="minorHAnsi" w:cstheme="minorBidi"/>
                 <w:sz w:val="21"/>
                 <w:szCs w:val="21"/>
               </w:rPr>
@@ -2056,7 +2056,7 @@
                   </w:pPr>
                   <w:r>
                     <w:rPr>
-                      <w:rFonts w:ascii="Aptos" w:cs="Aptos" w:eastAsia="Aptos" w:hAnsi="Aptos"/>
+                      <w:rFonts w:asciiTheme="minorHAnsi" w:hAnsiTheme="minorHAnsi" w:eastAsiaTheme="minorHAnsi" w:cstheme="minorBidi"/>
                       <w:b/>
                       <w:bCs/>
                       <w:color w:val="FFFFFF"/>
@@ -2115,7 +2115,7 @@
                   </w:pPr>
                   <w:r>
                     <w:rPr>
-                      <w:rFonts w:ascii="Aptos" w:cs="Aptos" w:eastAsia="Aptos" w:hAnsi="Aptos"/>
+                      <w:rFonts w:asciiTheme="minorHAnsi" w:hAnsiTheme="minorHAnsi" w:eastAsiaTheme="minorHAnsi" w:cstheme="minorBidi"/>
                       <w:b/>
                       <w:bCs/>
                       <w:sz w:val="16"/>
@@ -2150,7 +2150,7 @@
                   </w:pPr>
                   <w:r>
                     <w:rPr>
-                      <w:rFonts w:ascii="Aptos" w:cs="Aptos" w:eastAsia="Aptos" w:hAnsi="Aptos"/>
+                      <w:rFonts w:asciiTheme="minorHAnsi" w:hAnsiTheme="minorHAnsi" w:eastAsiaTheme="minorHAnsi" w:cstheme="minorBidi"/>
                       <w:b/>
                       <w:bCs/>
                       <w:sz w:val="16"/>
@@ -2190,7 +2190,7 @@
                   </w:pPr>
                   <w:r>
                     <w:rPr>
-                      <w:rFonts w:ascii="Aptos" w:cs="Aptos" w:eastAsia="Aptos" w:hAnsi="Aptos"/>
+                      <w:rFonts w:asciiTheme="minorHAnsi" w:hAnsiTheme="minorHAnsi" w:eastAsiaTheme="minorHAnsi" w:cstheme="minorBidi"/>
                       <w:b/>
                       <w:bCs/>
                       <w:sz w:val="16"/>
@@ -2231,7 +2231,7 @@
                   </w:pPr>
                   <w:r>
                     <w:rPr>
-                      <w:rFonts w:ascii="Aptos" w:cs="Aptos" w:eastAsia="Aptos" w:hAnsi="Aptos"/>
+                      <w:rFonts w:asciiTheme="minorHAnsi" w:hAnsiTheme="minorHAnsi" w:eastAsiaTheme="minorHAnsi" w:cstheme="minorBidi"/>
                       <w:sz w:val="16"/>
                       <w:szCs w:val="16"/>
                     </w:rPr>
@@ -2264,7 +2264,7 @@
                   </w:pPr>
                   <w:r>
                     <w:rPr>
-                      <w:rFonts w:ascii="Aptos" w:cs="Aptos" w:eastAsia="Aptos" w:hAnsi="Aptos"/>
+                      <w:rFonts w:asciiTheme="minorHAnsi" w:hAnsiTheme="minorHAnsi" w:eastAsiaTheme="minorHAnsi" w:cstheme="minorBidi"/>
                       <w:sz w:val="16"/>
                       <w:szCs w:val="16"/>
                     </w:rPr>
@@ -2302,7 +2302,7 @@
                   </w:pPr>
                   <w:r>
                     <w:rPr>
-                      <w:rFonts w:ascii="Aptos" w:cs="Aptos" w:eastAsia="Aptos" w:hAnsi="Aptos"/>
+                      <w:rFonts w:asciiTheme="minorHAnsi" w:hAnsiTheme="minorHAnsi" w:eastAsiaTheme="minorHAnsi" w:cstheme="minorBidi"/>
                       <w:b/>
                       <w:bCs/>
                       <w:sz w:val="16"/>
@@ -2343,7 +2343,7 @@
                   </w:pPr>
                   <w:r>
                     <w:rPr>
-                      <w:rFonts w:ascii="Aptos" w:cs="Aptos" w:eastAsia="Aptos" w:hAnsi="Aptos"/>
+                      <w:rFonts w:asciiTheme="minorHAnsi" w:hAnsiTheme="minorHAnsi" w:eastAsiaTheme="minorHAnsi" w:cstheme="minorBidi"/>
                       <w:sz w:val="16"/>
                       <w:szCs w:val="16"/>
                     </w:rPr>
@@ -2376,7 +2376,7 @@
                   </w:pPr>
                   <w:r>
                     <w:rPr>
-                      <w:rFonts w:ascii="Aptos" w:cs="Aptos" w:eastAsia="Aptos" w:hAnsi="Aptos"/>
+                      <w:rFonts w:asciiTheme="minorHAnsi" w:hAnsiTheme="minorHAnsi" w:eastAsiaTheme="minorHAnsi" w:cstheme="minorBidi"/>
                       <w:sz w:val="16"/>
                       <w:szCs w:val="16"/>
                     </w:rPr>
@@ -2414,7 +2414,7 @@
                   </w:pPr>
                   <w:r>
                     <w:rPr>
-                      <w:rFonts w:ascii="Aptos" w:cs="Aptos" w:eastAsia="Aptos" w:hAnsi="Aptos"/>
+                      <w:rFonts w:asciiTheme="minorHAnsi" w:hAnsiTheme="minorHAnsi" w:eastAsiaTheme="minorHAnsi" w:cstheme="minorBidi"/>
                       <w:b/>
                       <w:bCs/>
                       <w:sz w:val="16"/>
@@ -2455,7 +2455,7 @@
                   </w:pPr>
                   <w:r>
                     <w:rPr>
-                      <w:rFonts w:ascii="Aptos" w:cs="Aptos" w:eastAsia="Aptos" w:hAnsi="Aptos"/>
+                      <w:rFonts w:asciiTheme="minorHAnsi" w:hAnsiTheme="minorHAnsi" w:eastAsiaTheme="minorHAnsi" w:cstheme="minorBidi"/>
                       <w:sz w:val="16"/>
                       <w:szCs w:val="16"/>
                     </w:rPr>
@@ -2488,7 +2488,7 @@
                   </w:pPr>
                   <w:r>
                     <w:rPr>
-                      <w:rFonts w:ascii="Aptos" w:cs="Aptos" w:eastAsia="Aptos" w:hAnsi="Aptos"/>
+                      <w:rFonts w:asciiTheme="minorHAnsi" w:hAnsiTheme="minorHAnsi" w:eastAsiaTheme="minorHAnsi" w:cstheme="minorBidi"/>
                       <w:sz w:val="16"/>
                       <w:szCs w:val="16"/>
                     </w:rPr>
@@ -2526,7 +2526,7 @@
                   </w:pPr>
                   <w:r>
                     <w:rPr>
-                      <w:rFonts w:ascii="Aptos" w:cs="Aptos" w:eastAsia="Aptos" w:hAnsi="Aptos"/>
+                      <w:rFonts w:asciiTheme="minorHAnsi" w:hAnsiTheme="minorHAnsi" w:eastAsiaTheme="minorHAnsi" w:cstheme="minorBidi"/>
                       <w:b/>
                       <w:bCs/>
                       <w:sz w:val="16"/>
@@ -2567,7 +2567,7 @@
                   </w:pPr>
                   <w:r>
                     <w:rPr>
-                      <w:rFonts w:ascii="Aptos" w:cs="Aptos" w:eastAsia="Aptos" w:hAnsi="Aptos"/>
+                      <w:rFonts w:asciiTheme="minorHAnsi" w:hAnsiTheme="minorHAnsi" w:eastAsiaTheme="minorHAnsi" w:cstheme="minorBidi"/>
                       <w:sz w:val="16"/>
                       <w:szCs w:val="16"/>
                     </w:rPr>
@@ -2600,7 +2600,7 @@
                   </w:pPr>
                   <w:r>
                     <w:rPr>
-                      <w:rFonts w:ascii="Aptos" w:cs="Aptos" w:eastAsia="Aptos" w:hAnsi="Aptos"/>
+                      <w:rFonts w:asciiTheme="minorHAnsi" w:hAnsiTheme="minorHAnsi" w:eastAsiaTheme="minorHAnsi" w:cstheme="minorBidi"/>
                       <w:sz w:val="16"/>
                       <w:szCs w:val="16"/>
                     </w:rPr>
@@ -2635,7 +2635,7 @@
             </w:pPr>
             <w:r>
               <w:rPr>
-                <w:rFonts w:ascii="Aptos" w:cs="Aptos" w:eastAsia="Aptos" w:hAnsi="Aptos"/>
+                <w:rFonts w:asciiTheme="minorHAnsi" w:hAnsiTheme="minorHAnsi" w:eastAsiaTheme="minorHAnsi" w:cstheme="minorBidi"/>
                 <w:sz w:val="21"/>
                 <w:szCs w:val="21"/>
               </w:rPr>
@@ -2701,7 +2701,7 @@
                   </w:pPr>
                   <w:r>
                     <w:rPr>
-                      <w:rFonts w:ascii="Aptos" w:cs="Aptos" w:eastAsia="Aptos" w:hAnsi="Aptos"/>
+                      <w:rFonts w:asciiTheme="minorHAnsi" w:hAnsiTheme="minorHAnsi" w:eastAsiaTheme="minorHAnsi" w:cstheme="minorBidi"/>
                       <w:b/>
                       <w:bCs/>
                       <w:color w:val="FFFFFF"/>
@@ -2761,7 +2761,7 @@
                   </w:pPr>
                   <w:r>
                     <w:rPr>
-                      <w:rFonts w:ascii="Aptos" w:cs="Aptos" w:eastAsia="Aptos" w:hAnsi="Aptos"/>
+                      <w:rFonts w:asciiTheme="minorHAnsi" w:hAnsiTheme="minorHAnsi" w:eastAsiaTheme="minorHAnsi" w:cstheme="minorBidi"/>
                       <w:b/>
                       <w:bCs/>
                       <w:sz w:val="16"/>
@@ -2796,7 +2796,7 @@
                   </w:pPr>
                   <w:r>
                     <w:rPr>
-                      <w:rFonts w:ascii="Aptos" w:cs="Aptos" w:eastAsia="Aptos" w:hAnsi="Aptos"/>
+                      <w:rFonts w:asciiTheme="minorHAnsi" w:hAnsiTheme="minorHAnsi" w:eastAsiaTheme="minorHAnsi" w:cstheme="minorBidi"/>
                       <w:b/>
                       <w:bCs/>
                       <w:sz w:val="16"/>
@@ -2831,7 +2831,7 @@
                   </w:pPr>
                   <w:r>
                     <w:rPr>
-                      <w:rFonts w:ascii="Aptos" w:cs="Aptos" w:eastAsia="Aptos" w:hAnsi="Aptos"/>
+                      <w:rFonts w:asciiTheme="minorHAnsi" w:hAnsiTheme="minorHAnsi" w:eastAsiaTheme="minorHAnsi" w:cstheme="minorBidi"/>
                       <w:b/>
                       <w:bCs/>
                       <w:sz w:val="16"/>
@@ -2871,7 +2871,7 @@
                   </w:pPr>
                   <w:r>
                     <w:rPr>
-                      <w:rFonts w:ascii="Aptos" w:cs="Aptos" w:eastAsia="Aptos" w:hAnsi="Aptos"/>
+                      <w:rFonts w:asciiTheme="minorHAnsi" w:hAnsiTheme="minorHAnsi" w:eastAsiaTheme="minorHAnsi" w:cstheme="minorBidi"/>
                       <w:sz w:val="16"/>
                       <w:szCs w:val="16"/>
                     </w:rPr>
@@ -2904,7 +2904,7 @@
                   </w:pPr>
                   <w:r>
                     <w:rPr>
-                      <w:rFonts w:ascii="Aptos" w:cs="Aptos" w:eastAsia="Aptos" w:hAnsi="Aptos"/>
+                      <w:rFonts w:asciiTheme="minorHAnsi" w:hAnsiTheme="minorHAnsi" w:eastAsiaTheme="minorHAnsi" w:cstheme="minorBidi"/>
                       <w:sz w:val="16"/>
                       <w:szCs w:val="16"/>
                     </w:rPr>
@@ -2937,7 +2937,7 @@
                   </w:pPr>
                   <w:r>
                     <w:rPr>
-                      <w:rFonts w:ascii="Aptos" w:cs="Aptos" w:eastAsia="Aptos" w:hAnsi="Aptos"/>
+                      <w:rFonts w:asciiTheme="minorHAnsi" w:hAnsiTheme="minorHAnsi" w:eastAsiaTheme="minorHAnsi" w:cstheme="minorBidi"/>
                       <w:sz w:val="16"/>
                       <w:szCs w:val="16"/>
                     </w:rPr>
@@ -2975,7 +2975,7 @@
                   </w:pPr>
                   <w:r>
                     <w:rPr>
-                      <w:rFonts w:ascii="Aptos" w:cs="Aptos" w:eastAsia="Aptos" w:hAnsi="Aptos"/>
+                      <w:rFonts w:asciiTheme="minorHAnsi" w:hAnsiTheme="minorHAnsi" w:eastAsiaTheme="minorHAnsi" w:cstheme="minorBidi"/>
                       <w:sz w:val="16"/>
                       <w:szCs w:val="16"/>
                     </w:rPr>
@@ -3008,7 +3008,7 @@
                   </w:pPr>
                   <w:r>
                     <w:rPr>
-                      <w:rFonts w:ascii="Aptos" w:cs="Aptos" w:eastAsia="Aptos" w:hAnsi="Aptos"/>
+                      <w:rFonts w:asciiTheme="minorHAnsi" w:hAnsiTheme="minorHAnsi" w:eastAsiaTheme="minorHAnsi" w:cstheme="minorBidi"/>
                       <w:sz w:val="16"/>
                       <w:szCs w:val="16"/>
                     </w:rPr>
@@ -3041,7 +3041,7 @@
                   </w:pPr>
                   <w:r>
                     <w:rPr>
-                      <w:rFonts w:ascii="Aptos" w:cs="Aptos" w:eastAsia="Aptos" w:hAnsi="Aptos"/>
+                      <w:rFonts w:asciiTheme="minorHAnsi" w:hAnsiTheme="minorHAnsi" w:eastAsiaTheme="minorHAnsi" w:cstheme="minorBidi"/>
                       <w:sz w:val="16"/>
                       <w:szCs w:val="16"/>
                     </w:rPr>
@@ -3079,7 +3079,7 @@
                   </w:pPr>
                   <w:r>
                     <w:rPr>
-                      <w:rFonts w:ascii="Aptos" w:cs="Aptos" w:eastAsia="Aptos" w:hAnsi="Aptos"/>
+                      <w:rFonts w:asciiTheme="minorHAnsi" w:hAnsiTheme="minorHAnsi" w:eastAsiaTheme="minorHAnsi" w:cstheme="minorBidi"/>
                       <w:sz w:val="16"/>
                       <w:szCs w:val="16"/>
                     </w:rPr>
@@ -3112,7 +3112,7 @@
                   </w:pPr>
                   <w:r>
                     <w:rPr>
-                      <w:rFonts w:ascii="Aptos" w:cs="Aptos" w:eastAsia="Aptos" w:hAnsi="Aptos"/>
+                      <w:rFonts w:asciiTheme="minorHAnsi" w:hAnsiTheme="minorHAnsi" w:eastAsiaTheme="minorHAnsi" w:cstheme="minorBidi"/>
                       <w:sz w:val="16"/>
                       <w:szCs w:val="16"/>
                     </w:rPr>
@@ -3145,7 +3145,7 @@
                   </w:pPr>
                   <w:r>
                     <w:rPr>
-                      <w:rFonts w:ascii="Aptos" w:cs="Aptos" w:eastAsia="Aptos" w:hAnsi="Aptos"/>
+                      <w:rFonts w:asciiTheme="minorHAnsi" w:hAnsiTheme="minorHAnsi" w:eastAsiaTheme="minorHAnsi" w:cstheme="minorBidi"/>
                       <w:sz w:val="16"/>
                       <w:szCs w:val="16"/>
                     </w:rPr>
@@ -3183,7 +3183,7 @@
                   </w:pPr>
                   <w:r>
                     <w:rPr>
-                      <w:rFonts w:ascii="Aptos" w:cs="Aptos" w:eastAsia="Aptos" w:hAnsi="Aptos"/>
+                      <w:rFonts w:asciiTheme="minorHAnsi" w:hAnsiTheme="minorHAnsi" w:eastAsiaTheme="minorHAnsi" w:cstheme="minorBidi"/>
                       <w:sz w:val="16"/>
                       <w:szCs w:val="16"/>
                     </w:rPr>
@@ -3216,7 +3216,7 @@
                   </w:pPr>
                   <w:r>
                     <w:rPr>
-                      <w:rFonts w:ascii="Aptos" w:cs="Aptos" w:eastAsia="Aptos" w:hAnsi="Aptos"/>
+                      <w:rFonts w:asciiTheme="minorHAnsi" w:hAnsiTheme="minorHAnsi" w:eastAsiaTheme="minorHAnsi" w:cstheme="minorBidi"/>
                       <w:sz w:val="16"/>
                       <w:szCs w:val="16"/>
                     </w:rPr>
@@ -3249,7 +3249,7 @@
                   </w:pPr>
                   <w:r>
                     <w:rPr>
-                      <w:rFonts w:ascii="Aptos" w:cs="Aptos" w:eastAsia="Aptos" w:hAnsi="Aptos"/>
+                      <w:rFonts w:asciiTheme="minorHAnsi" w:hAnsiTheme="minorHAnsi" w:eastAsiaTheme="minorHAnsi" w:cstheme="minorBidi"/>
                       <w:sz w:val="16"/>
                       <w:szCs w:val="16"/>
                     </w:rPr>
@@ -3287,7 +3287,7 @@
                   </w:pPr>
                   <w:r>
                     <w:rPr>
-                      <w:rFonts w:ascii="Aptos" w:cs="Aptos" w:eastAsia="Aptos" w:hAnsi="Aptos"/>
+                      <w:rFonts w:asciiTheme="minorHAnsi" w:hAnsiTheme="minorHAnsi" w:eastAsiaTheme="minorHAnsi" w:cstheme="minorBidi"/>
                       <w:sz w:val="16"/>
                       <w:szCs w:val="16"/>
                     </w:rPr>
@@ -3320,7 +3320,7 @@
                   </w:pPr>
                   <w:r>
                     <w:rPr>
-                      <w:rFonts w:ascii="Aptos" w:cs="Aptos" w:eastAsia="Aptos" w:hAnsi="Aptos"/>
+                      <w:rFonts w:asciiTheme="minorHAnsi" w:hAnsiTheme="minorHAnsi" w:eastAsiaTheme="minorHAnsi" w:cstheme="minorBidi"/>
                       <w:sz w:val="16"/>
                       <w:szCs w:val="16"/>
                     </w:rPr>
@@ -3353,7 +3353,7 @@
                   </w:pPr>
                   <w:r>
                     <w:rPr>
-                      <w:rFonts w:ascii="Aptos" w:cs="Aptos" w:eastAsia="Aptos" w:hAnsi="Aptos"/>
+                      <w:rFonts w:asciiTheme="minorHAnsi" w:hAnsiTheme="minorHAnsi" w:eastAsiaTheme="minorHAnsi" w:cstheme="minorBidi"/>
                       <w:sz w:val="16"/>
                       <w:szCs w:val="16"/>
                     </w:rPr>
@@ -3369,7 +3369,7 @@
             </w:pPr>
             <w:r>
               <w:rPr>
-                <w:rFonts w:ascii="Aptos" w:cs="Aptos" w:eastAsia="Aptos" w:hAnsi="Aptos"/>
+                <w:rFonts w:asciiTheme="minorHAnsi" w:hAnsiTheme="minorHAnsi" w:eastAsiaTheme="minorHAnsi" w:cstheme="minorBidi"/>
                 <w:sz w:val="21"/>
                 <w:szCs w:val="21"/>
               </w:rPr>
@@ -3417,7 +3417,7 @@
                   </w:pPr>
                   <w:r>
                     <w:rPr>
-                      <w:rFonts w:ascii="Aptos" w:cs="Aptos" w:eastAsia="Aptos" w:hAnsi="Aptos"/>
+                      <w:rFonts w:asciiTheme="minorHAnsi" w:hAnsiTheme="minorHAnsi" w:eastAsiaTheme="minorHAnsi" w:cstheme="minorBidi"/>
                       <w:b/>
                       <w:bCs/>
                       <w:color w:val="FFFFFF"/>
@@ -3477,7 +3477,7 @@
                   </w:pPr>
                   <w:r>
                     <w:rPr>
-                      <w:rFonts w:ascii="Aptos" w:cs="Aptos" w:eastAsia="Aptos" w:hAnsi="Aptos"/>
+                      <w:rFonts w:asciiTheme="minorHAnsi" w:hAnsiTheme="minorHAnsi" w:eastAsiaTheme="minorHAnsi" w:cstheme="minorBidi"/>
                       <w:b/>
                       <w:bCs/>
                       <w:sz w:val="16"/>
@@ -3512,7 +3512,7 @@
                   </w:pPr>
                   <w:r>
                     <w:rPr>
-                      <w:rFonts w:ascii="Aptos" w:cs="Aptos" w:eastAsia="Aptos" w:hAnsi="Aptos"/>
+                      <w:rFonts w:asciiTheme="minorHAnsi" w:hAnsiTheme="minorHAnsi" w:eastAsiaTheme="minorHAnsi" w:cstheme="minorBidi"/>
                       <w:b/>
                       <w:bCs/>
                       <w:sz w:val="16"/>
@@ -3547,7 +3547,7 @@
                   </w:pPr>
                   <w:r>
                     <w:rPr>
-                      <w:rFonts w:ascii="Aptos" w:cs="Aptos" w:eastAsia="Aptos" w:hAnsi="Aptos"/>
+                      <w:rFonts w:asciiTheme="minorHAnsi" w:hAnsiTheme="minorHAnsi" w:eastAsiaTheme="minorHAnsi" w:cstheme="minorBidi"/>
                       <w:b/>
                       <w:bCs/>
                       <w:sz w:val="16"/>
@@ -3587,7 +3587,7 @@
                   </w:pPr>
                   <w:r>
                     <w:rPr>
-                      <w:rFonts w:ascii="Aptos" w:cs="Aptos" w:eastAsia="Aptos" w:hAnsi="Aptos"/>
+                      <w:rFonts w:asciiTheme="minorHAnsi" w:hAnsiTheme="minorHAnsi" w:eastAsiaTheme="minorHAnsi" w:cstheme="minorBidi"/>
                       <w:sz w:val="16"/>
                       <w:szCs w:val="16"/>
                     </w:rPr>
@@ -3620,7 +3620,7 @@
                   </w:pPr>
                   <w:r>
                     <w:rPr>
-                      <w:rFonts w:ascii="Aptos" w:cs="Aptos" w:eastAsia="Aptos" w:hAnsi="Aptos"/>
+                      <w:rFonts w:asciiTheme="minorHAnsi" w:hAnsiTheme="minorHAnsi" w:eastAsiaTheme="minorHAnsi" w:cstheme="minorBidi"/>
                       <w:sz w:val="16"/>
                       <w:szCs w:val="16"/>
                     </w:rPr>
@@ -3653,7 +3653,7 @@
                   </w:pPr>
                   <w:r>
                     <w:rPr>
-                      <w:rFonts w:ascii="Aptos" w:cs="Aptos" w:eastAsia="Aptos" w:hAnsi="Aptos"/>
+                      <w:rFonts w:asciiTheme="minorHAnsi" w:hAnsiTheme="minorHAnsi" w:eastAsiaTheme="minorHAnsi" w:cstheme="minorBidi"/>
                       <w:sz w:val="16"/>
                       <w:szCs w:val="16"/>
                     </w:rPr>
@@ -3691,7 +3691,7 @@
                   </w:pPr>
                   <w:r>
                     <w:rPr>
-                      <w:rFonts w:ascii="Aptos" w:cs="Aptos" w:eastAsia="Aptos" w:hAnsi="Aptos"/>
+                      <w:rFonts w:asciiTheme="minorHAnsi" w:hAnsiTheme="minorHAnsi" w:eastAsiaTheme="minorHAnsi" w:cstheme="minorBidi"/>
                       <w:sz w:val="16"/>
                       <w:szCs w:val="16"/>
                     </w:rPr>
@@ -3724,7 +3724,7 @@
                   </w:pPr>
                   <w:r>
                     <w:rPr>
-                      <w:rFonts w:ascii="Aptos" w:cs="Aptos" w:eastAsia="Aptos" w:hAnsi="Aptos"/>
+                      <w:rFonts w:asciiTheme="minorHAnsi" w:hAnsiTheme="minorHAnsi" w:eastAsiaTheme="minorHAnsi" w:cstheme="minorBidi"/>
                       <w:sz w:val="16"/>
                       <w:szCs w:val="16"/>
                     </w:rPr>
@@ -3757,7 +3757,7 @@
                   </w:pPr>
                   <w:r>
                     <w:rPr>
-                      <w:rFonts w:ascii="Aptos" w:cs="Aptos" w:eastAsia="Aptos" w:hAnsi="Aptos"/>
+                      <w:rFonts w:asciiTheme="minorHAnsi" w:hAnsiTheme="minorHAnsi" w:eastAsiaTheme="minorHAnsi" w:cstheme="minorBidi"/>
                       <w:sz w:val="16"/>
                       <w:szCs w:val="16"/>
                     </w:rPr>
@@ -3795,7 +3795,7 @@
                   </w:pPr>
                   <w:r>
                     <w:rPr>
-                      <w:rFonts w:ascii="Aptos" w:cs="Aptos" w:eastAsia="Aptos" w:hAnsi="Aptos"/>
+                      <w:rFonts w:asciiTheme="minorHAnsi" w:hAnsiTheme="minorHAnsi" w:eastAsiaTheme="minorHAnsi" w:cstheme="minorBidi"/>
                       <w:sz w:val="16"/>
                       <w:szCs w:val="16"/>
                     </w:rPr>
@@ -3828,7 +3828,7 @@
                   </w:pPr>
                   <w:r>
                     <w:rPr>
-                      <w:rFonts w:ascii="Aptos" w:cs="Aptos" w:eastAsia="Aptos" w:hAnsi="Aptos"/>
+                      <w:rFonts w:asciiTheme="minorHAnsi" w:hAnsiTheme="minorHAnsi" w:eastAsiaTheme="minorHAnsi" w:cstheme="minorBidi"/>
                       <w:sz w:val="16"/>
                       <w:szCs w:val="16"/>
                     </w:rPr>
@@ -3861,7 +3861,7 @@
                   </w:pPr>
                   <w:r>
                     <w:rPr>
-                      <w:rFonts w:ascii="Aptos" w:cs="Aptos" w:eastAsia="Aptos" w:hAnsi="Aptos"/>
+                      <w:rFonts w:asciiTheme="minorHAnsi" w:hAnsiTheme="minorHAnsi" w:eastAsiaTheme="minorHAnsi" w:cstheme="minorBidi"/>
                       <w:sz w:val="16"/>
                       <w:szCs w:val="16"/>
                     </w:rPr>
@@ -3899,7 +3899,7 @@
                   </w:pPr>
                   <w:r>
                     <w:rPr>
-                      <w:rFonts w:ascii="Aptos" w:cs="Aptos" w:eastAsia="Aptos" w:hAnsi="Aptos"/>
+                      <w:rFonts w:asciiTheme="minorHAnsi" w:hAnsiTheme="minorHAnsi" w:eastAsiaTheme="minorHAnsi" w:cstheme="minorBidi"/>
                       <w:sz w:val="16"/>
                       <w:szCs w:val="16"/>
                     </w:rPr>
@@ -3932,7 +3932,7 @@
                   </w:pPr>
                   <w:r>
                     <w:rPr>
-                      <w:rFonts w:ascii="Aptos" w:cs="Aptos" w:eastAsia="Aptos" w:hAnsi="Aptos"/>
+                      <w:rFonts w:asciiTheme="minorHAnsi" w:hAnsiTheme="minorHAnsi" w:eastAsiaTheme="minorHAnsi" w:cstheme="minorBidi"/>
                       <w:sz w:val="16"/>
                       <w:szCs w:val="16"/>
                     </w:rPr>
@@ -3965,7 +3965,7 @@
                   </w:pPr>
                   <w:r>
                     <w:rPr>
-                      <w:rFonts w:ascii="Aptos" w:cs="Aptos" w:eastAsia="Aptos" w:hAnsi="Aptos"/>
+                      <w:rFonts w:asciiTheme="minorHAnsi" w:hAnsiTheme="minorHAnsi" w:eastAsiaTheme="minorHAnsi" w:cstheme="minorBidi"/>
                       <w:sz w:val="16"/>
                       <w:szCs w:val="16"/>
                     </w:rPr>
@@ -4003,7 +4003,7 @@
                   </w:pPr>
                   <w:r>
                     <w:rPr>
-                      <w:rFonts w:ascii="Aptos" w:cs="Aptos" w:eastAsia="Aptos" w:hAnsi="Aptos"/>
+                      <w:rFonts w:asciiTheme="minorHAnsi" w:hAnsiTheme="minorHAnsi" w:eastAsiaTheme="minorHAnsi" w:cstheme="minorBidi"/>
                       <w:sz w:val="16"/>
                       <w:szCs w:val="16"/>
                     </w:rPr>
@@ -4036,7 +4036,7 @@
                   </w:pPr>
                   <w:r>
                     <w:rPr>
-                      <w:rFonts w:ascii="Aptos" w:cs="Aptos" w:eastAsia="Aptos" w:hAnsi="Aptos"/>
+                      <w:rFonts w:asciiTheme="minorHAnsi" w:hAnsiTheme="minorHAnsi" w:eastAsiaTheme="minorHAnsi" w:cstheme="minorBidi"/>
                       <w:sz w:val="16"/>
                       <w:szCs w:val="16"/>
                     </w:rPr>
@@ -4069,7 +4069,7 @@
                   </w:pPr>
                   <w:r>
                     <w:rPr>
-                      <w:rFonts w:ascii="Aptos" w:cs="Aptos" w:eastAsia="Aptos" w:hAnsi="Aptos"/>
+                      <w:rFonts w:asciiTheme="minorHAnsi" w:hAnsiTheme="minorHAnsi" w:eastAsiaTheme="minorHAnsi" w:cstheme="minorBidi"/>
                       <w:sz w:val="16"/>
                       <w:szCs w:val="16"/>
                     </w:rPr>
@@ -4085,7 +4085,7 @@
             </w:pPr>
             <w:r>
               <w:rPr>
-                <w:rFonts w:ascii="Aptos" w:cs="Aptos" w:eastAsia="Aptos" w:hAnsi="Aptos"/>
+                <w:rFonts w:asciiTheme="minorHAnsi" w:hAnsiTheme="minorHAnsi" w:eastAsiaTheme="minorHAnsi" w:cstheme="minorBidi"/>
                 <w:sz w:val="21"/>
                 <w:szCs w:val="21"/>
               </w:rPr>
@@ -4133,7 +4133,7 @@
                   </w:pPr>
                   <w:r>
                     <w:rPr>
-                      <w:rFonts w:ascii="Aptos" w:cs="Aptos" w:eastAsia="Aptos" w:hAnsi="Aptos"/>
+                      <w:rFonts w:asciiTheme="minorHAnsi" w:hAnsiTheme="minorHAnsi" w:eastAsiaTheme="minorHAnsi" w:cstheme="minorBidi"/>
                       <w:b/>
                       <w:bCs/>
                       <w:color w:val="FFFFFF"/>
@@ -4193,7 +4193,7 @@
                   </w:pPr>
                   <w:r>
                     <w:rPr>
-                      <w:rFonts w:ascii="Aptos" w:cs="Aptos" w:eastAsia="Aptos" w:hAnsi="Aptos"/>
+                      <w:rFonts w:asciiTheme="minorHAnsi" w:hAnsiTheme="minorHAnsi" w:eastAsiaTheme="minorHAnsi" w:cstheme="minorBidi"/>
                       <w:b/>
                       <w:bCs/>
                       <w:sz w:val="16"/>
@@ -4228,7 +4228,7 @@
                   </w:pPr>
                   <w:r>
                     <w:rPr>
-                      <w:rFonts w:ascii="Aptos" w:cs="Aptos" w:eastAsia="Aptos" w:hAnsi="Aptos"/>
+                      <w:rFonts w:asciiTheme="minorHAnsi" w:hAnsiTheme="minorHAnsi" w:eastAsiaTheme="minorHAnsi" w:cstheme="minorBidi"/>
                       <w:b/>
                       <w:bCs/>
                       <w:sz w:val="16"/>
@@ -4263,7 +4263,7 @@
                   </w:pPr>
                   <w:r>
                     <w:rPr>
-                      <w:rFonts w:ascii="Aptos" w:cs="Aptos" w:eastAsia="Aptos" w:hAnsi="Aptos"/>
+                      <w:rFonts w:asciiTheme="minorHAnsi" w:hAnsiTheme="minorHAnsi" w:eastAsiaTheme="minorHAnsi" w:cstheme="minorBidi"/>
                       <w:b/>
                       <w:bCs/>
                       <w:sz w:val="16"/>
@@ -4303,7 +4303,7 @@
                   </w:pPr>
                   <w:r>
                     <w:rPr>
-                      <w:rFonts w:ascii="Aptos" w:cs="Aptos" w:eastAsia="Aptos" w:hAnsi="Aptos"/>
+                      <w:rFonts w:asciiTheme="minorHAnsi" w:hAnsiTheme="minorHAnsi" w:eastAsiaTheme="minorHAnsi" w:cstheme="minorBidi"/>
                       <w:sz w:val="16"/>
                       <w:szCs w:val="16"/>
                     </w:rPr>
@@ -4336,7 +4336,7 @@
                   </w:pPr>
                   <w:r>
                     <w:rPr>
-                      <w:rFonts w:ascii="Aptos" w:cs="Aptos" w:eastAsia="Aptos" w:hAnsi="Aptos"/>
+                      <w:rFonts w:asciiTheme="minorHAnsi" w:hAnsiTheme="minorHAnsi" w:eastAsiaTheme="minorHAnsi" w:cstheme="minorBidi"/>
                       <w:sz w:val="16"/>
                       <w:szCs w:val="16"/>
                     </w:rPr>
@@ -4369,7 +4369,7 @@
                   </w:pPr>
                   <w:r>
                     <w:rPr>
-                      <w:rFonts w:ascii="Aptos" w:cs="Aptos" w:eastAsia="Aptos" w:hAnsi="Aptos"/>
+                      <w:rFonts w:asciiTheme="minorHAnsi" w:hAnsiTheme="minorHAnsi" w:eastAsiaTheme="minorHAnsi" w:cstheme="minorBidi"/>
                       <w:sz w:val="16"/>
                       <w:szCs w:val="16"/>
                     </w:rPr>
@@ -4407,7 +4407,7 @@
                   </w:pPr>
                   <w:r>
                     <w:rPr>
-                      <w:rFonts w:ascii="Aptos" w:cs="Aptos" w:eastAsia="Aptos" w:hAnsi="Aptos"/>
+                      <w:rFonts w:asciiTheme="minorHAnsi" w:hAnsiTheme="minorHAnsi" w:eastAsiaTheme="minorHAnsi" w:cstheme="minorBidi"/>
                       <w:sz w:val="16"/>
                       <w:szCs w:val="16"/>
                     </w:rPr>
@@ -4440,7 +4440,7 @@
                   </w:pPr>
                   <w:r>
                     <w:rPr>
-                      <w:rFonts w:ascii="Aptos" w:cs="Aptos" w:eastAsia="Aptos" w:hAnsi="Aptos"/>
+                      <w:rFonts w:asciiTheme="minorHAnsi" w:hAnsiTheme="minorHAnsi" w:eastAsiaTheme="minorHAnsi" w:cstheme="minorBidi"/>
                       <w:sz w:val="16"/>
                       <w:szCs w:val="16"/>
                     </w:rPr>
@@ -4473,7 +4473,7 @@
                   </w:pPr>
                   <w:r>
                     <w:rPr>
-                      <w:rFonts w:ascii="Aptos" w:cs="Aptos" w:eastAsia="Aptos" w:hAnsi="Aptos"/>
+                      <w:rFonts w:asciiTheme="minorHAnsi" w:hAnsiTheme="minorHAnsi" w:eastAsiaTheme="minorHAnsi" w:cstheme="minorBidi"/>
                       <w:sz w:val="16"/>
                       <w:szCs w:val="16"/>
                     </w:rPr>
@@ -4511,7 +4511,7 @@
                   </w:pPr>
                   <w:r>
                     <w:rPr>
-                      <w:rFonts w:ascii="Aptos" w:cs="Aptos" w:eastAsia="Aptos" w:hAnsi="Aptos"/>
+                      <w:rFonts w:asciiTheme="minorHAnsi" w:hAnsiTheme="minorHAnsi" w:eastAsiaTheme="minorHAnsi" w:cstheme="minorBidi"/>
                       <w:sz w:val="16"/>
                       <w:szCs w:val="16"/>
                     </w:rPr>
@@ -4544,7 +4544,7 @@
                   </w:pPr>
                   <w:r>
                     <w:rPr>
-                      <w:rFonts w:ascii="Aptos" w:cs="Aptos" w:eastAsia="Aptos" w:hAnsi="Aptos"/>
+                      <w:rFonts w:asciiTheme="minorHAnsi" w:hAnsiTheme="minorHAnsi" w:eastAsiaTheme="minorHAnsi" w:cstheme="minorBidi"/>
                       <w:sz w:val="16"/>
                       <w:szCs w:val="16"/>
                     </w:rPr>
@@ -4577,7 +4577,7 @@
                   </w:pPr>
                   <w:r>
                     <w:rPr>
-                      <w:rFonts w:ascii="Aptos" w:cs="Aptos" w:eastAsia="Aptos" w:hAnsi="Aptos"/>
+                      <w:rFonts w:asciiTheme="minorHAnsi" w:hAnsiTheme="minorHAnsi" w:eastAsiaTheme="minorHAnsi" w:cstheme="minorBidi"/>
                       <w:sz w:val="16"/>
                       <w:szCs w:val="16"/>
                     </w:rPr>
@@ -4615,7 +4615,7 @@
                   </w:pPr>
                   <w:r>
                     <w:rPr>
-                      <w:rFonts w:ascii="Aptos" w:cs="Aptos" w:eastAsia="Aptos" w:hAnsi="Aptos"/>
+                      <w:rFonts w:asciiTheme="minorHAnsi" w:hAnsiTheme="minorHAnsi" w:eastAsiaTheme="minorHAnsi" w:cstheme="minorBidi"/>
                       <w:sz w:val="16"/>
                       <w:szCs w:val="16"/>
                     </w:rPr>
@@ -4648,7 +4648,7 @@
                   </w:pPr>
                   <w:r>
                     <w:rPr>
-                      <w:rFonts w:ascii="Aptos" w:cs="Aptos" w:eastAsia="Aptos" w:hAnsi="Aptos"/>
+                      <w:rFonts w:asciiTheme="minorHAnsi" w:hAnsiTheme="minorHAnsi" w:eastAsiaTheme="minorHAnsi" w:cstheme="minorBidi"/>
                       <w:sz w:val="16"/>
                       <w:szCs w:val="16"/>
                     </w:rPr>
@@ -4681,7 +4681,7 @@
                   </w:pPr>
                   <w:r>
                     <w:rPr>
-                      <w:rFonts w:ascii="Aptos" w:cs="Aptos" w:eastAsia="Aptos" w:hAnsi="Aptos"/>
+                      <w:rFonts w:asciiTheme="minorHAnsi" w:hAnsiTheme="minorHAnsi" w:eastAsiaTheme="minorHAnsi" w:cstheme="minorBidi"/>
                       <w:sz w:val="16"/>
                       <w:szCs w:val="16"/>
                     </w:rPr>
@@ -4719,7 +4719,7 @@
                   </w:pPr>
                   <w:r>
                     <w:rPr>
-                      <w:rFonts w:ascii="Aptos" w:cs="Aptos" w:eastAsia="Aptos" w:hAnsi="Aptos"/>
+                      <w:rFonts w:asciiTheme="minorHAnsi" w:hAnsiTheme="minorHAnsi" w:eastAsiaTheme="minorHAnsi" w:cstheme="minorBidi"/>
                       <w:sz w:val="16"/>
                       <w:szCs w:val="16"/>
                     </w:rPr>
@@ -4752,7 +4752,7 @@
                   </w:pPr>
                   <w:r>
                     <w:rPr>
-                      <w:rFonts w:ascii="Aptos" w:cs="Aptos" w:eastAsia="Aptos" w:hAnsi="Aptos"/>
+                      <w:rFonts w:asciiTheme="minorHAnsi" w:hAnsiTheme="minorHAnsi" w:eastAsiaTheme="minorHAnsi" w:cstheme="minorBidi"/>
                       <w:sz w:val="16"/>
                       <w:szCs w:val="16"/>
                     </w:rPr>
@@ -4785,7 +4785,7 @@
                   </w:pPr>
                   <w:r>
                     <w:rPr>
-                      <w:rFonts w:ascii="Aptos" w:cs="Aptos" w:eastAsia="Aptos" w:hAnsi="Aptos"/>
+                      <w:rFonts w:asciiTheme="minorHAnsi" w:hAnsiTheme="minorHAnsi" w:eastAsiaTheme="minorHAnsi" w:cstheme="minorBidi"/>
                       <w:sz w:val="16"/>
                       <w:szCs w:val="16"/>
                     </w:rPr>
@@ -4823,7 +4823,7 @@
                   </w:pPr>
                   <w:r>
                     <w:rPr>
-                      <w:rFonts w:ascii="Aptos" w:cs="Aptos" w:eastAsia="Aptos" w:hAnsi="Aptos"/>
+                      <w:rFonts w:asciiTheme="minorHAnsi" w:hAnsiTheme="minorHAnsi" w:eastAsiaTheme="minorHAnsi" w:cstheme="minorBidi"/>
                       <w:sz w:val="16"/>
                       <w:szCs w:val="16"/>
                     </w:rPr>
@@ -4856,7 +4856,7 @@
                   </w:pPr>
                   <w:r>
                     <w:rPr>
-                      <w:rFonts w:ascii="Aptos" w:cs="Aptos" w:eastAsia="Aptos" w:hAnsi="Aptos"/>
+                      <w:rFonts w:asciiTheme="minorHAnsi" w:hAnsiTheme="minorHAnsi" w:eastAsiaTheme="minorHAnsi" w:cstheme="minorBidi"/>
                       <w:sz w:val="16"/>
                       <w:szCs w:val="16"/>
                     </w:rPr>
@@ -4889,7 +4889,7 @@
                   </w:pPr>
                   <w:r>
                     <w:rPr>
-                      <w:rFonts w:ascii="Aptos" w:cs="Aptos" w:eastAsia="Aptos" w:hAnsi="Aptos"/>
+                      <w:rFonts w:asciiTheme="minorHAnsi" w:hAnsiTheme="minorHAnsi" w:eastAsiaTheme="minorHAnsi" w:cstheme="minorBidi"/>
                       <w:sz w:val="16"/>
                       <w:szCs w:val="16"/>
                     </w:rPr>
@@ -4927,7 +4927,7 @@
                   </w:pPr>
                   <w:r>
                     <w:rPr>
-                      <w:rFonts w:ascii="Aptos" w:cs="Aptos" w:eastAsia="Aptos" w:hAnsi="Aptos"/>
+                      <w:rFonts w:asciiTheme="minorHAnsi" w:hAnsiTheme="minorHAnsi" w:eastAsiaTheme="minorHAnsi" w:cstheme="minorBidi"/>
                       <w:sz w:val="16"/>
                       <w:szCs w:val="16"/>
                     </w:rPr>
@@ -4960,7 +4960,7 @@
                   </w:pPr>
                   <w:r>
                     <w:rPr>
-                      <w:rFonts w:ascii="Aptos" w:cs="Aptos" w:eastAsia="Aptos" w:hAnsi="Aptos"/>
+                      <w:rFonts w:asciiTheme="minorHAnsi" w:hAnsiTheme="minorHAnsi" w:eastAsiaTheme="minorHAnsi" w:cstheme="minorBidi"/>
                       <w:sz w:val="16"/>
                       <w:szCs w:val="16"/>
                     </w:rPr>
@@ -4993,7 +4993,7 @@
                   </w:pPr>
                   <w:r>
                     <w:rPr>
-                      <w:rFonts w:ascii="Aptos" w:cs="Aptos" w:eastAsia="Aptos" w:hAnsi="Aptos"/>
+                      <w:rFonts w:asciiTheme="minorHAnsi" w:hAnsiTheme="minorHAnsi" w:eastAsiaTheme="minorHAnsi" w:cstheme="minorBidi"/>
                       <w:sz w:val="16"/>
                       <w:szCs w:val="16"/>
                     </w:rPr>
@@ -5031,7 +5031,7 @@
                   </w:pPr>
                   <w:r>
                     <w:rPr>
-                      <w:rFonts w:ascii="Aptos" w:cs="Aptos" w:eastAsia="Aptos" w:hAnsi="Aptos"/>
+                      <w:rFonts w:asciiTheme="minorHAnsi" w:hAnsiTheme="minorHAnsi" w:eastAsiaTheme="minorHAnsi" w:cstheme="minorBidi"/>
                       <w:sz w:val="16"/>
                       <w:szCs w:val="16"/>
                     </w:rPr>
@@ -5064,7 +5064,7 @@
                   </w:pPr>
                   <w:r>
                     <w:rPr>
-                      <w:rFonts w:ascii="Aptos" w:cs="Aptos" w:eastAsia="Aptos" w:hAnsi="Aptos"/>
+                      <w:rFonts w:asciiTheme="minorHAnsi" w:hAnsiTheme="minorHAnsi" w:eastAsiaTheme="minorHAnsi" w:cstheme="minorBidi"/>
                       <w:sz w:val="16"/>
                       <w:szCs w:val="16"/>
                     </w:rPr>
@@ -5097,7 +5097,7 @@
                   </w:pPr>
                   <w:r>
                     <w:rPr>
-                      <w:rFonts w:ascii="Aptos" w:cs="Aptos" w:eastAsia="Aptos" w:hAnsi="Aptos"/>
+                      <w:rFonts w:asciiTheme="minorHAnsi" w:hAnsiTheme="minorHAnsi" w:eastAsiaTheme="minorHAnsi" w:cstheme="minorBidi"/>
                       <w:sz w:val="16"/>
                       <w:szCs w:val="16"/>
                     </w:rPr>
@@ -5135,7 +5135,7 @@
                   </w:pPr>
                   <w:r>
                     <w:rPr>
-                      <w:rFonts w:ascii="Aptos" w:cs="Aptos" w:eastAsia="Aptos" w:hAnsi="Aptos"/>
+                      <w:rFonts w:asciiTheme="minorHAnsi" w:hAnsiTheme="minorHAnsi" w:eastAsiaTheme="minorHAnsi" w:cstheme="minorBidi"/>
                       <w:sz w:val="16"/>
                       <w:szCs w:val="16"/>
                     </w:rPr>
@@ -5168,7 +5168,7 @@
                   </w:pPr>
                   <w:r>
                     <w:rPr>
-                      <w:rFonts w:ascii="Aptos" w:cs="Aptos" w:eastAsia="Aptos" w:hAnsi="Aptos"/>
+                      <w:rFonts w:asciiTheme="minorHAnsi" w:hAnsiTheme="minorHAnsi" w:eastAsiaTheme="minorHAnsi" w:cstheme="minorBidi"/>
                       <w:sz w:val="16"/>
                       <w:szCs w:val="16"/>
                     </w:rPr>
@@ -5201,7 +5201,7 @@
                   </w:pPr>
                   <w:r>
                     <w:rPr>
-                      <w:rFonts w:ascii="Aptos" w:cs="Aptos" w:eastAsia="Aptos" w:hAnsi="Aptos"/>
+                      <w:rFonts w:asciiTheme="minorHAnsi" w:hAnsiTheme="minorHAnsi" w:eastAsiaTheme="minorHAnsi" w:cstheme="minorBidi"/>
                       <w:sz w:val="16"/>
                       <w:szCs w:val="16"/>
                     </w:rPr>
@@ -5239,7 +5239,7 @@
                   </w:pPr>
                   <w:r>
                     <w:rPr>
-                      <w:rFonts w:ascii="Aptos" w:cs="Aptos" w:eastAsia="Aptos" w:hAnsi="Aptos"/>
+                      <w:rFonts w:asciiTheme="minorHAnsi" w:hAnsiTheme="minorHAnsi" w:eastAsiaTheme="minorHAnsi" w:cstheme="minorBidi"/>
                       <w:sz w:val="16"/>
                       <w:szCs w:val="16"/>
                     </w:rPr>
@@ -5272,7 +5272,7 @@
                   </w:pPr>
                   <w:r>
                     <w:rPr>
-                      <w:rFonts w:ascii="Aptos" w:cs="Aptos" w:eastAsia="Aptos" w:hAnsi="Aptos"/>
+                      <w:rFonts w:asciiTheme="minorHAnsi" w:hAnsiTheme="minorHAnsi" w:eastAsiaTheme="minorHAnsi" w:cstheme="minorBidi"/>
                       <w:sz w:val="16"/>
                       <w:szCs w:val="16"/>
                     </w:rPr>
@@ -5305,7 +5305,7 @@
                   </w:pPr>
                   <w:r>
                     <w:rPr>
-                      <w:rFonts w:ascii="Aptos" w:cs="Aptos" w:eastAsia="Aptos" w:hAnsi="Aptos"/>
+                      <w:rFonts w:asciiTheme="minorHAnsi" w:hAnsiTheme="minorHAnsi" w:eastAsiaTheme="minorHAnsi" w:cstheme="minorBidi"/>
                       <w:sz w:val="16"/>
                       <w:szCs w:val="16"/>
                     </w:rPr>
@@ -5321,7 +5321,7 @@
             </w:pPr>
             <w:r>
               <w:rPr>
-                <w:rFonts w:ascii="Aptos" w:cs="Aptos" w:eastAsia="Aptos" w:hAnsi="Aptos"/>
+                <w:rFonts w:asciiTheme="minorHAnsi" w:hAnsiTheme="minorHAnsi" w:eastAsiaTheme="minorHAnsi" w:cstheme="minorBidi"/>
                 <w:sz w:val="21"/>
                 <w:szCs w:val="21"/>
               </w:rPr>
@@ -5337,7 +5337,7 @@
       </w:pPr>
       <w:r>
         <w:rPr>
-          <w:rFonts w:ascii="Aptos" w:cs="Aptos" w:eastAsia="Aptos" w:hAnsi="Aptos"/>
+          <w:rFonts w:asciiTheme="minorHAnsi" w:hAnsiTheme="minorHAnsi" w:eastAsiaTheme="minorHAnsi" w:cstheme="minorBidi"/>
           <w:sz w:val="21"/>
           <w:szCs w:val="21"/>
         </w:rPr>
@@ -5384,7 +5384,7 @@
             </w:pPr>
             <w:r>
               <w:rPr>
-                <w:rFonts w:ascii="Aptos" w:cs="Aptos" w:eastAsia="Aptos" w:hAnsi="Aptos"/>
+                <w:rFonts w:asciiTheme="minorHAnsi" w:hAnsiTheme="minorHAnsi" w:eastAsiaTheme="minorHAnsi" w:cstheme="minorBidi"/>
                 <w:b/>
                 <w:bCs/>
                 <w:sz w:val="21"/>
@@ -5399,7 +5399,7 @@
             </w:pPr>
             <w:r>
               <w:rPr>
-                <w:rFonts w:ascii="Aptos" w:cs="Aptos" w:eastAsia="Aptos" w:hAnsi="Aptos"/>
+                <w:rFonts w:asciiTheme="minorHAnsi" w:hAnsiTheme="minorHAnsi" w:eastAsiaTheme="minorHAnsi" w:cstheme="minorBidi"/>
                 <w:sz w:val="21"/>
                 <w:szCs w:val="21"/>
               </w:rPr>
@@ -5412,7 +5412,7 @@
             </w:pPr>
             <w:r>
               <w:rPr>
-                <w:rFonts w:ascii="Aptos" w:cs="Aptos" w:eastAsia="Aptos" w:hAnsi="Aptos"/>
+                <w:rFonts w:asciiTheme="minorHAnsi" w:hAnsiTheme="minorHAnsi" w:eastAsiaTheme="minorHAnsi" w:cstheme="minorBidi"/>
                 <w:sz w:val="21"/>
                 <w:szCs w:val="21"/>
               </w:rPr>
@@ -5425,7 +5425,7 @@
             </w:pPr>
             <w:r>
               <w:rPr>
-                <w:rFonts w:ascii="Aptos" w:cs="Aptos" w:eastAsia="Aptos" w:hAnsi="Aptos"/>
+                <w:rFonts w:asciiTheme="minorHAnsi" w:hAnsiTheme="minorHAnsi" w:eastAsiaTheme="minorHAnsi" w:cstheme="minorBidi"/>
                 <w:sz w:val="21"/>
                 <w:szCs w:val="21"/>
               </w:rPr>
@@ -5438,7 +5438,7 @@
             </w:pPr>
             <w:r>
               <w:rPr>
-                <w:rFonts w:ascii="Aptos" w:cs="Aptos" w:eastAsia="Aptos" w:hAnsi="Aptos"/>
+                <w:rFonts w:asciiTheme="minorHAnsi" w:hAnsiTheme="minorHAnsi" w:eastAsiaTheme="minorHAnsi" w:cstheme="minorBidi"/>
                 <w:sz w:val="21"/>
                 <w:szCs w:val="21"/>
               </w:rPr>
@@ -5453,10 +5453,10 @@
         <w:spacing w:after="120" w:before="200"/>
         <w:jc w:val="center"/>
       </w:pPr>
-      <w:hyperlink w:history="1" r:id="rIdaznkv3rr1gcuqvsxd34xv">
+      <w:hyperlink w:history="1" r:id="rIdixmu_0ajmu1xiz3mvnfvk">
         <w:r>
           <w:rPr>
-            <w:rFonts w:ascii="Aptos" w:cs="Aptos" w:eastAsia="Aptos" w:hAnsi="Aptos"/>
+            <w:rFonts w:asciiTheme="minorHAnsi" w:hAnsiTheme="minorHAnsi" w:eastAsiaTheme="minorHAnsi" w:cstheme="minorBidi"/>
             <w:color w:val="37003C"/>
             <w:sz w:val="16"/>
             <w:szCs w:val="16"/>
@@ -5668,7 +5668,7 @@
   <w:docDefaults>
     <w:rPrDefault>
       <w:rPr>
-        <w:rFonts w:ascii="Aptos" w:cs="Aptos" w:eastAsia="Aptos" w:hAnsi="Aptos"/>
+        <w:rFonts w:asciiTheme="minorHAnsi" w:hAnsiTheme="minorHAnsi" w:eastAsiaTheme="minorHAnsi" w:cstheme="minorBidi"/>
         <w:sz w:val="21"/>
         <w:szCs w:val="21"/>
       </w:rPr>
@@ -5896,7 +5896,7 @@
     </a:clrScheme>
     <a:fontScheme name="Office">
       <a:majorFont>
-        <a:latin typeface="Calibri Light" panose="020F0302020204030204"/>
+        <a:latin typeface="Aptos" panose="020B0004020202020204"/>
         <a:ea typeface=""/>
         <a:cs typeface=""/>
         <a:font script="Jpan" typeface="游ゴシック Light"/>
@@ -5948,7 +5948,7 @@
         <a:font script="Tfng" typeface="Ebrima"/>
       </a:majorFont>
       <a:minorFont>
-        <a:latin typeface="Calibri" panose="020F0502020204030204"/>
+        <a:latin typeface="Aptos" panose="020B0004020202020204"/>
         <a:ea typeface=""/>
         <a:cs typeface=""/>
         <a:font script="Jpan" typeface="游明朝"/>

</xml_diff>